<commit_message>
Reduce proposal to 4 programs and rebalance budget
Co-Authored-By: Claude Sonnet 5.5 <noreply@anthropic.com>
Claude-Session: https://claude.ai/code/session_017gbqRLzmn2gitw8QdSmDmj
</commit_message>
<xml_diff>
--- a/2027_DIP_교육프로그램_제안서_초안.docx
+++ b/2027_DIP_교육프로그램_제안서_초안.docx
@@ -326,7 +326,7 @@
           <w:sz w:val="21"/>
           <w:szCs w:val="21"/>
         </w:rPr>
-        <w:t xml:space="preserve">연간 총 5개 프로그램(총 8회차 운영), 총 사업비 2,000만 원 규모로 구성하였습니다.</w:t>
+        <w:t xml:space="preserve">연간 총 4개 프로그램(총 6회차 운영), 총 사업비 2,000만 원 규모로 구성하였습니다.</w:t>
       </w:r>
     </w:p>
     <w:tbl>
@@ -625,7 +625,7 @@
                 <w:sz w:val="19"/>
                 <w:szCs w:val="19"/>
               </w:rPr>
-              <w:t xml:space="preserve">최신 기술 실습 세미나 ①</w:t>
+              <w:t xml:space="preserve">최신 기술 실습 세미나</w:t>
             </w:r>
           </w:p>
         </w:tc>
@@ -747,7 +747,7 @@
                 <w:sz w:val="19"/>
                 <w:szCs w:val="19"/>
               </w:rPr>
-              <w:t xml:space="preserve">350만 원</w:t>
+              <w:t xml:space="preserve">500만 원</w:t>
             </w:r>
           </w:p>
         </w:tc>
@@ -1126,7 +1126,7 @@
                 <w:sz w:val="19"/>
                 <w:szCs w:val="19"/>
               </w:rPr>
-              <w:t xml:space="preserve">250만 원</w:t>
+              <w:t xml:space="preserve">350만 원</w:t>
             </w:r>
           </w:p>
         </w:tc>
@@ -1192,194 +1192,6 @@
                 <w:sz w:val="19"/>
                 <w:szCs w:val="19"/>
               </w:rPr>
-              <w:t xml:space="preserve">최신 기술 실습 세미나 ②</w:t>
-            </w:r>
-          </w:p>
-        </w:tc>
-        <w:tc>
-          <w:tcPr>
-            <w:tcW w:type="dxa" w:w="1000"/>
-            <w:tcBorders>
-              <w:top w:val="single" w:color="BFBFBF" w:sz="4"/>
-              <w:left w:val="single" w:color="BFBFBF" w:sz="4"/>
-              <w:bottom w:val="single" w:color="BFBFBF" w:sz="4"/>
-              <w:right w:val="single" w:color="BFBFBF" w:sz="4"/>
-            </w:tcBorders>
-            <w:tcMar>
-              <w:top w:type="dxa" w:w="70"/>
-              <w:left w:type="dxa" w:w="110"/>
-              <w:bottom w:type="dxa" w:w="70"/>
-              <w:right w:type="dxa" w:w="110"/>
-            </w:tcMar>
-          </w:tcPr>
-          <w:p>
-            <w:pPr>
-              <w:spacing w:after="20" w:line="280"/>
-              <w:jc w:val="center"/>
-            </w:pPr>
-            <w:r>
-              <w:rPr>
-                <w:rFonts w:ascii="맑은 고딕" w:cs="맑은 고딕" w:eastAsia="맑은 고딕" w:hAnsi="맑은 고딕"/>
-                <w:sz w:val="19"/>
-                <w:szCs w:val="19"/>
-              </w:rPr>
-              <w:t xml:space="preserve">8월</w:t>
-            </w:r>
-          </w:p>
-        </w:tc>
-        <w:tc>
-          <w:tcPr>
-            <w:tcW w:type="dxa" w:w="2100"/>
-            <w:tcBorders>
-              <w:top w:val="single" w:color="BFBFBF" w:sz="4"/>
-              <w:left w:val="single" w:color="BFBFBF" w:sz="4"/>
-              <w:bottom w:val="single" w:color="BFBFBF" w:sz="4"/>
-              <w:right w:val="single" w:color="BFBFBF" w:sz="4"/>
-            </w:tcBorders>
-            <w:tcMar>
-              <w:top w:type="dxa" w:w="70"/>
-              <w:left w:type="dxa" w:w="110"/>
-              <w:bottom w:type="dxa" w:w="70"/>
-              <w:right w:type="dxa" w:w="110"/>
-            </w:tcMar>
-          </w:tcPr>
-          <w:p>
-            <w:pPr>
-              <w:spacing w:after="20" w:line="280"/>
-            </w:pPr>
-            <w:r>
-              <w:rPr>
-                <w:rFonts w:ascii="맑은 고딕" w:cs="맑은 고딕" w:eastAsia="맑은 고딕" w:hAnsi="맑은 고딕"/>
-                <w:sz w:val="19"/>
-                <w:szCs w:val="19"/>
-              </w:rPr>
-              <w:t xml:space="preserve">40명 × 2회차(총 80명)</w:t>
-            </w:r>
-          </w:p>
-        </w:tc>
-        <w:tc>
-          <w:tcPr>
-            <w:tcW w:type="dxa" w:w="2138"/>
-            <w:tcBorders>
-              <w:top w:val="single" w:color="BFBFBF" w:sz="4"/>
-              <w:left w:val="single" w:color="BFBFBF" w:sz="4"/>
-              <w:bottom w:val="single" w:color="BFBFBF" w:sz="4"/>
-              <w:right w:val="single" w:color="BFBFBF" w:sz="4"/>
-            </w:tcBorders>
-            <w:tcMar>
-              <w:top w:type="dxa" w:w="70"/>
-              <w:left w:type="dxa" w:w="110"/>
-              <w:bottom w:type="dxa" w:w="70"/>
-              <w:right w:type="dxa" w:w="110"/>
-            </w:tcMar>
-          </w:tcPr>
-          <w:p>
-            <w:pPr>
-              <w:spacing w:after="20" w:line="280"/>
-            </w:pPr>
-            <w:r>
-              <w:rPr>
-                <w:rFonts w:ascii="맑은 고딕" w:cs="맑은 고딕" w:eastAsia="맑은 고딕" w:hAnsi="맑은 고딕"/>
-                <w:sz w:val="19"/>
-                <w:szCs w:val="19"/>
-              </w:rPr>
-              <w:t xml:space="preserve">실습 중심 세미나</w:t>
-            </w:r>
-          </w:p>
-        </w:tc>
-        <w:tc>
-          <w:tcPr>
-            <w:tcW w:type="dxa" w:w="1400"/>
-            <w:tcBorders>
-              <w:top w:val="single" w:color="BFBFBF" w:sz="4"/>
-              <w:left w:val="single" w:color="BFBFBF" w:sz="4"/>
-              <w:bottom w:val="single" w:color="BFBFBF" w:sz="4"/>
-              <w:right w:val="single" w:color="BFBFBF" w:sz="4"/>
-            </w:tcBorders>
-            <w:tcMar>
-              <w:top w:type="dxa" w:w="70"/>
-              <w:left w:type="dxa" w:w="110"/>
-              <w:bottom w:type="dxa" w:w="70"/>
-              <w:right w:type="dxa" w:w="110"/>
-            </w:tcMar>
-          </w:tcPr>
-          <w:p>
-            <w:pPr>
-              <w:spacing w:after="20" w:line="280"/>
-              <w:jc w:val="right"/>
-            </w:pPr>
-            <w:r>
-              <w:rPr>
-                <w:rFonts w:ascii="맑은 고딕" w:cs="맑은 고딕" w:eastAsia="맑은 고딕" w:hAnsi="맑은 고딕"/>
-                <w:sz w:val="19"/>
-                <w:szCs w:val="19"/>
-              </w:rPr>
-              <w:t xml:space="preserve">350만 원</w:t>
-            </w:r>
-          </w:p>
-        </w:tc>
-      </w:tr>
-      <w:tr>
-        <w:trPr>
-          <w:tblHeader w:val="off"/>
-        </w:trPr>
-        <w:tc>
-          <w:tcPr>
-            <w:tcW w:type="dxa" w:w="500"/>
-            <w:tcBorders>
-              <w:top w:val="single" w:color="BFBFBF" w:sz="4"/>
-              <w:left w:val="single" w:color="BFBFBF" w:sz="4"/>
-              <w:bottom w:val="single" w:color="BFBFBF" w:sz="4"/>
-              <w:right w:val="single" w:color="BFBFBF" w:sz="4"/>
-            </w:tcBorders>
-            <w:tcMar>
-              <w:top w:type="dxa" w:w="70"/>
-              <w:left w:type="dxa" w:w="110"/>
-              <w:bottom w:type="dxa" w:w="70"/>
-              <w:right w:type="dxa" w:w="110"/>
-            </w:tcMar>
-          </w:tcPr>
-          <w:p>
-            <w:pPr>
-              <w:spacing w:after="20" w:line="280"/>
-              <w:jc w:val="center"/>
-            </w:pPr>
-            <w:r>
-              <w:rPr>
-                <w:rFonts w:ascii="맑은 고딕" w:cs="맑은 고딕" w:eastAsia="맑은 고딕" w:hAnsi="맑은 고딕"/>
-                <w:sz w:val="19"/>
-                <w:szCs w:val="19"/>
-              </w:rPr>
-              <w:t xml:space="preserve">5</w:t>
-            </w:r>
-          </w:p>
-        </w:tc>
-        <w:tc>
-          <w:tcPr>
-            <w:tcW w:type="dxa" w:w="2500"/>
-            <w:tcBorders>
-              <w:top w:val="single" w:color="BFBFBF" w:sz="4"/>
-              <w:left w:val="single" w:color="BFBFBF" w:sz="4"/>
-              <w:bottom w:val="single" w:color="BFBFBF" w:sz="4"/>
-              <w:right w:val="single" w:color="BFBFBF" w:sz="4"/>
-            </w:tcBorders>
-            <w:tcMar>
-              <w:top w:type="dxa" w:w="70"/>
-              <w:left w:type="dxa" w:w="110"/>
-              <w:bottom w:type="dxa" w:w="70"/>
-              <w:right w:type="dxa" w:w="110"/>
-            </w:tcMar>
-          </w:tcPr>
-          <w:p>
-            <w:pPr>
-              <w:spacing w:after="20" w:line="280"/>
-            </w:pPr>
-            <w:r>
-              <w:rPr>
-                <w:rFonts w:ascii="맑은 고딕" w:cs="맑은 고딕" w:eastAsia="맑은 고딕" w:hAnsi="맑은 고딕"/>
-                <w:sz w:val="19"/>
-                <w:szCs w:val="19"/>
-              </w:rPr>
               <w:t xml:space="preserve">산업 트렌드 세미나 ②
 (AI·헬스케어)</w:t>
             </w:r>
@@ -1504,7 +1316,7 @@
                 <w:sz w:val="19"/>
                 <w:szCs w:val="19"/>
               </w:rPr>
-              <w:t xml:space="preserve">250만 원</w:t>
+              <w:t xml:space="preserve">350만 원</w:t>
             </w:r>
           </w:p>
         </w:tc>
@@ -1709,7 +1521,7 @@
           <w:sz w:val="21"/>
           <w:szCs w:val="21"/>
         </w:rPr>
-        <w:t xml:space="preserve">※ 2번은 회차당 20명 규모로 2회 운영하며, 1·4번의 회차 수 및 세부 예산은 협의를 통해 조정할 수 있습니다.</w:t>
+        <w:t xml:space="preserve">※ 2번은 회차당 20명 규모로 2회 운영하며, 프로그램별 세부 예산은 협의를 통해 조정할 수 있습니다.</w:t>
       </w:r>
     </w:p>
     <w:p>
@@ -1746,7 +1558,7 @@
           <w:sz w:val="24"/>
           <w:szCs w:val="24"/>
         </w:rPr>
-        <w:t xml:space="preserve">프로그램 1. 최신 기술 실습 세미나 ① (6월 초)</w:t>
+        <w:t xml:space="preserve">프로그램 1. 최신 기술 실습 세미나 (6월 초)</w:t>
       </w:r>
     </w:p>
     <w:tbl>
@@ -2957,301 +2769,7 @@
           <w:sz w:val="24"/>
           <w:szCs w:val="24"/>
         </w:rPr>
-        <w:t xml:space="preserve">프로그램 4. 최신 기술 실습 세미나 ② (8월)</w:t>
-      </w:r>
-    </w:p>
-    <w:tbl>
-      <w:tblPr>
-        <w:tblW w:type="dxa" w:w="9638"/>
-        <w:tblBorders>
-          <w:top w:val="single" w:color="auto" w:sz="4"/>
-          <w:left w:val="single" w:color="auto" w:sz="4"/>
-          <w:bottom w:val="single" w:color="auto" w:sz="4"/>
-          <w:right w:val="single" w:color="auto" w:sz="4"/>
-          <w:insideH w:val="single" w:color="auto" w:sz="4"/>
-          <w:insideV w:val="single" w:color="auto" w:sz="4"/>
-        </w:tblBorders>
-      </w:tblPr>
-      <w:tblGrid>
-        <w:gridCol w:w="1900"/>
-        <w:gridCol w:w="7738"/>
-      </w:tblGrid>
-      <w:tr>
-        <w:tc>
-          <w:tcPr>
-            <w:tcW w:type="dxa" w:w="1900"/>
-            <w:tcBorders>
-              <w:top w:val="single" w:color="BFBFBF" w:sz="4"/>
-              <w:left w:val="single" w:color="BFBFBF" w:sz="4"/>
-              <w:bottom w:val="single" w:color="BFBFBF" w:sz="4"/>
-              <w:right w:val="single" w:color="BFBFBF" w:sz="4"/>
-            </w:tcBorders>
-            <w:shd w:fill="D9E2F3" w:color="auto" w:val="clear"/>
-            <w:tcMar>
-              <w:top w:type="dxa" w:w="70"/>
-              <w:left w:type="dxa" w:w="110"/>
-              <w:bottom w:type="dxa" w:w="70"/>
-              <w:right w:type="dxa" w:w="110"/>
-            </w:tcMar>
-          </w:tcPr>
-          <w:p>
-            <w:pPr>
-              <w:spacing w:after="20" w:line="280"/>
-            </w:pPr>
-            <w:r>
-              <w:rPr>
-                <w:rFonts w:ascii="맑은 고딕" w:cs="맑은 고딕" w:eastAsia="맑은 고딕" w:hAnsi="맑은 고딕"/>
-                <w:b/>
-                <w:bCs/>
-                <w:sz w:val="19"/>
-                <w:szCs w:val="19"/>
-              </w:rPr>
-              <w:t xml:space="preserve">목적</w:t>
-            </w:r>
-          </w:p>
-        </w:tc>
-        <w:tc>
-          <w:tcPr>
-            <w:tcW w:type="dxa" w:w="7738"/>
-            <w:tcBorders>
-              <w:top w:val="single" w:color="BFBFBF" w:sz="4"/>
-              <w:left w:val="single" w:color="BFBFBF" w:sz="4"/>
-              <w:bottom w:val="single" w:color="BFBFBF" w:sz="4"/>
-              <w:right w:val="single" w:color="BFBFBF" w:sz="4"/>
-            </w:tcBorders>
-            <w:tcMar>
-              <w:top w:type="dxa" w:w="70"/>
-              <w:left w:type="dxa" w:w="110"/>
-              <w:bottom w:type="dxa" w:w="70"/>
-              <w:right w:type="dxa" w:w="110"/>
-            </w:tcMar>
-          </w:tcPr>
-          <w:p>
-            <w:pPr>
-              <w:spacing w:after="20" w:line="280"/>
-            </w:pPr>
-            <w:r>
-              <w:rPr>
-                <w:rFonts w:ascii="맑은 고딕" w:cs="맑은 고딕" w:eastAsia="맑은 고딕" w:hAnsi="맑은 고딕"/>
-                <w:sz w:val="19"/>
-                <w:szCs w:val="19"/>
-              </w:rPr>
-              <w:t xml:space="preserve">프로그램 1의 참가자 반응과 DIP 수요를 반영한 심화·확장 실습</w:t>
-            </w:r>
-          </w:p>
-        </w:tc>
-      </w:tr>
-      <w:tr>
-        <w:tc>
-          <w:tcPr>
-            <w:tcW w:type="dxa" w:w="1900"/>
-            <w:tcBorders>
-              <w:top w:val="single" w:color="BFBFBF" w:sz="4"/>
-              <w:left w:val="single" w:color="BFBFBF" w:sz="4"/>
-              <w:bottom w:val="single" w:color="BFBFBF" w:sz="4"/>
-              <w:right w:val="single" w:color="BFBFBF" w:sz="4"/>
-            </w:tcBorders>
-            <w:shd w:fill="D9E2F3" w:color="auto" w:val="clear"/>
-            <w:tcMar>
-              <w:top w:type="dxa" w:w="70"/>
-              <w:left w:type="dxa" w:w="110"/>
-              <w:bottom w:type="dxa" w:w="70"/>
-              <w:right w:type="dxa" w:w="110"/>
-            </w:tcMar>
-          </w:tcPr>
-          <w:p>
-            <w:pPr>
-              <w:spacing w:after="20" w:line="280"/>
-            </w:pPr>
-            <w:r>
-              <w:rPr>
-                <w:rFonts w:ascii="맑은 고딕" w:cs="맑은 고딕" w:eastAsia="맑은 고딕" w:hAnsi="맑은 고딕"/>
-                <w:b/>
-                <w:bCs/>
-                <w:sz w:val="19"/>
-                <w:szCs w:val="19"/>
-              </w:rPr>
-              <w:t xml:space="preserve">대상 / 규모</w:t>
-            </w:r>
-          </w:p>
-        </w:tc>
-        <w:tc>
-          <w:tcPr>
-            <w:tcW w:type="dxa" w:w="7738"/>
-            <w:tcBorders>
-              <w:top w:val="single" w:color="BFBFBF" w:sz="4"/>
-              <w:left w:val="single" w:color="BFBFBF" w:sz="4"/>
-              <w:bottom w:val="single" w:color="BFBFBF" w:sz="4"/>
-              <w:right w:val="single" w:color="BFBFBF" w:sz="4"/>
-            </w:tcBorders>
-            <w:tcMar>
-              <w:top w:type="dxa" w:w="70"/>
-              <w:left w:type="dxa" w:w="110"/>
-              <w:bottom w:type="dxa" w:w="70"/>
-              <w:right w:type="dxa" w:w="110"/>
-            </w:tcMar>
-          </w:tcPr>
-          <w:p>
-            <w:pPr>
-              <w:spacing w:after="20" w:line="280"/>
-            </w:pPr>
-            <w:r>
-              <w:rPr>
-                <w:rFonts w:ascii="맑은 고딕" w:cs="맑은 고딕" w:eastAsia="맑은 고딕" w:hAnsi="맑은 고딕"/>
-                <w:sz w:val="19"/>
-                <w:szCs w:val="19"/>
-              </w:rPr>
-              <w:t xml:space="preserve">40명 × 2회차</w:t>
-            </w:r>
-          </w:p>
-        </w:tc>
-      </w:tr>
-      <w:tr>
-        <w:tc>
-          <w:tcPr>
-            <w:tcW w:type="dxa" w:w="1900"/>
-            <w:tcBorders>
-              <w:top w:val="single" w:color="BFBFBF" w:sz="4"/>
-              <w:left w:val="single" w:color="BFBFBF" w:sz="4"/>
-              <w:bottom w:val="single" w:color="BFBFBF" w:sz="4"/>
-              <w:right w:val="single" w:color="BFBFBF" w:sz="4"/>
-            </w:tcBorders>
-            <w:shd w:fill="D9E2F3" w:color="auto" w:val="clear"/>
-            <w:tcMar>
-              <w:top w:type="dxa" w:w="70"/>
-              <w:left w:type="dxa" w:w="110"/>
-              <w:bottom w:type="dxa" w:w="70"/>
-              <w:right w:type="dxa" w:w="110"/>
-            </w:tcMar>
-          </w:tcPr>
-          <w:p>
-            <w:pPr>
-              <w:spacing w:after="20" w:line="280"/>
-            </w:pPr>
-            <w:r>
-              <w:rPr>
-                <w:rFonts w:ascii="맑은 고딕" w:cs="맑은 고딕" w:eastAsia="맑은 고딕" w:hAnsi="맑은 고딕"/>
-                <w:b/>
-                <w:bCs/>
-                <w:sz w:val="19"/>
-                <w:szCs w:val="19"/>
-              </w:rPr>
-              <w:t xml:space="preserve">운영 방식</w:t>
-            </w:r>
-          </w:p>
-        </w:tc>
-        <w:tc>
-          <w:tcPr>
-            <w:tcW w:type="dxa" w:w="7738"/>
-            <w:tcBorders>
-              <w:top w:val="single" w:color="BFBFBF" w:sz="4"/>
-              <w:left w:val="single" w:color="BFBFBF" w:sz="4"/>
-              <w:bottom w:val="single" w:color="BFBFBF" w:sz="4"/>
-              <w:right w:val="single" w:color="BFBFBF" w:sz="4"/>
-            </w:tcBorders>
-            <w:tcMar>
-              <w:top w:type="dxa" w:w="70"/>
-              <w:left w:type="dxa" w:w="110"/>
-              <w:bottom w:type="dxa" w:w="70"/>
-              <w:right w:type="dxa" w:w="110"/>
-            </w:tcMar>
-          </w:tcPr>
-          <w:p>
-            <w:pPr>
-              <w:spacing w:after="20" w:line="280"/>
-            </w:pPr>
-            <w:r>
-              <w:rPr>
-                <w:rFonts w:ascii="맑은 고딕" w:cs="맑은 고딕" w:eastAsia="맑은 고딕" w:hAnsi="맑은 고딕"/>
-                <w:sz w:val="19"/>
-                <w:szCs w:val="19"/>
-              </w:rPr>
-              <w:t xml:space="preserve">프로그램 1과 동일한 실습 중심 구조, 주제는 상반기 만족도 조사 결과 반영하여 확정</w:t>
-            </w:r>
-          </w:p>
-        </w:tc>
-      </w:tr>
-      <w:tr>
-        <w:tc>
-          <w:tcPr>
-            <w:tcW w:type="dxa" w:w="1900"/>
-            <w:tcBorders>
-              <w:top w:val="single" w:color="BFBFBF" w:sz="4"/>
-              <w:left w:val="single" w:color="BFBFBF" w:sz="4"/>
-              <w:bottom w:val="single" w:color="BFBFBF" w:sz="4"/>
-              <w:right w:val="single" w:color="BFBFBF" w:sz="4"/>
-            </w:tcBorders>
-            <w:shd w:fill="D9E2F3" w:color="auto" w:val="clear"/>
-            <w:tcMar>
-              <w:top w:type="dxa" w:w="70"/>
-              <w:left w:type="dxa" w:w="110"/>
-              <w:bottom w:type="dxa" w:w="70"/>
-              <w:right w:type="dxa" w:w="110"/>
-            </w:tcMar>
-          </w:tcPr>
-          <w:p>
-            <w:pPr>
-              <w:spacing w:after="20" w:line="280"/>
-            </w:pPr>
-            <w:r>
-              <w:rPr>
-                <w:rFonts w:ascii="맑은 고딕" w:cs="맑은 고딕" w:eastAsia="맑은 고딕" w:hAnsi="맑은 고딕"/>
-                <w:b/>
-                <w:bCs/>
-                <w:sz w:val="19"/>
-                <w:szCs w:val="19"/>
-              </w:rPr>
-              <w:t xml:space="preserve">기대 결과</w:t>
-            </w:r>
-          </w:p>
-        </w:tc>
-        <w:tc>
-          <w:tcPr>
-            <w:tcW w:type="dxa" w:w="7738"/>
-            <w:tcBorders>
-              <w:top w:val="single" w:color="BFBFBF" w:sz="4"/>
-              <w:left w:val="single" w:color="BFBFBF" w:sz="4"/>
-              <w:bottom w:val="single" w:color="BFBFBF" w:sz="4"/>
-              <w:right w:val="single" w:color="BFBFBF" w:sz="4"/>
-            </w:tcBorders>
-            <w:tcMar>
-              <w:top w:type="dxa" w:w="70"/>
-              <w:left w:type="dxa" w:w="110"/>
-              <w:bottom w:type="dxa" w:w="70"/>
-              <w:right w:type="dxa" w:w="110"/>
-            </w:tcMar>
-          </w:tcPr>
-          <w:p>
-            <w:pPr>
-              <w:spacing w:after="20" w:line="280"/>
-            </w:pPr>
-            <w:r>
-              <w:rPr>
-                <w:rFonts w:ascii="맑은 고딕" w:cs="맑은 고딕" w:eastAsia="맑은 고딕" w:hAnsi="맑은 고딕"/>
-                <w:sz w:val="19"/>
-                <w:szCs w:val="19"/>
-              </w:rPr>
-              <w:t xml:space="preserve">상·하반기 연계 교육 체계 구축, 재참여 기업 대상 심화 과정 제공</w:t>
-            </w:r>
-          </w:p>
-        </w:tc>
-      </w:tr>
-    </w:tbl>
-    <w:p>
-      <w:pPr>
-        <w:pStyle w:val="Heading2"/>
-        <w:spacing w:after="100" w:before="220"/>
-      </w:pPr>
-      <w:r>
-        <w:rPr>
-          <w:rFonts w:ascii="맑은 고딕" w:cs="맑은 고딕" w:eastAsia="맑은 고딕" w:hAnsi="맑은 고딕"/>
-          <w:b/>
-          <w:bCs/>
-          <w:color w:val="1F3864"/>
-          <w:sz w:val="24"/>
-          <w:szCs w:val="24"/>
-        </w:rPr>
-        <w:t xml:space="preserve">프로그램 5. 산업 트렌드 세미나 ② – AI · 헬스케어 (9월)</w:t>
+        <w:t xml:space="preserve">프로그램 4. 산업 트렌드 세미나 ② – AI · 헬스케어 (9월)</w:t>
       </w:r>
     </w:p>
     <w:tbl>
@@ -3841,7 +3359,7 @@
                 <w:sz w:val="19"/>
                 <w:szCs w:val="19"/>
               </w:rPr>
-              <w:t xml:space="preserve">1. 최신 기술 실습 세미나 ①</w:t>
+              <w:t xml:space="preserve">1. 최신 기술 실습 세미나</w:t>
             </w:r>
           </w:p>
         </w:tc>
@@ -4189,7 +3707,7 @@
                 <w:sz w:val="19"/>
                 <w:szCs w:val="19"/>
               </w:rPr>
-              <w:t xml:space="preserve">8월</w:t>
+              <w:t xml:space="preserve">9월</w:t>
             </w:r>
           </w:p>
         </w:tc>
@@ -4219,133 +3737,7 @@
                 <w:sz w:val="19"/>
                 <w:szCs w:val="19"/>
               </w:rPr>
-              <w:t xml:space="preserve">4. 최신 기술 실습 세미나 ②</w:t>
-            </w:r>
-          </w:p>
-        </w:tc>
-        <w:tc>
-          <w:tcPr>
-            <w:tcW w:type="dxa" w:w="2300"/>
-            <w:tcBorders>
-              <w:top w:val="single" w:color="BFBFBF" w:sz="4"/>
-              <w:left w:val="single" w:color="BFBFBF" w:sz="4"/>
-              <w:bottom w:val="single" w:color="BFBFBF" w:sz="4"/>
-              <w:right w:val="single" w:color="BFBFBF" w:sz="4"/>
-            </w:tcBorders>
-            <w:tcMar>
-              <w:top w:type="dxa" w:w="70"/>
-              <w:left w:type="dxa" w:w="110"/>
-              <w:bottom w:type="dxa" w:w="70"/>
-              <w:right w:type="dxa" w:w="110"/>
-            </w:tcMar>
-          </w:tcPr>
-          <w:p>
-            <w:pPr>
-              <w:spacing w:after="20" w:line="280"/>
-            </w:pPr>
-            <w:r>
-              <w:rPr>
-                <w:rFonts w:ascii="맑은 고딕" w:cs="맑은 고딕" w:eastAsia="맑은 고딕" w:hAnsi="맑은 고딕"/>
-                <w:sz w:val="19"/>
-                <w:szCs w:val="19"/>
-              </w:rPr>
-              <w:t xml:space="preserve">40명 × 2회</w:t>
-            </w:r>
-          </w:p>
-        </w:tc>
-        <w:tc>
-          <w:tcPr>
-            <w:tcW w:type="dxa" w:w="2838"/>
-            <w:tcBorders>
-              <w:top w:val="single" w:color="BFBFBF" w:sz="4"/>
-              <w:left w:val="single" w:color="BFBFBF" w:sz="4"/>
-              <w:bottom w:val="single" w:color="BFBFBF" w:sz="4"/>
-              <w:right w:val="single" w:color="BFBFBF" w:sz="4"/>
-            </w:tcBorders>
-            <w:tcMar>
-              <w:top w:type="dxa" w:w="70"/>
-              <w:left w:type="dxa" w:w="110"/>
-              <w:bottom w:type="dxa" w:w="70"/>
-              <w:right w:type="dxa" w:w="110"/>
-            </w:tcMar>
-          </w:tcPr>
-          <w:p>
-            <w:pPr>
-              <w:spacing w:after="20" w:line="280"/>
-            </w:pPr>
-            <w:r>
-              <w:rPr>
-                <w:rFonts w:ascii="맑은 고딕" w:cs="맑은 고딕" w:eastAsia="맑은 고딕" w:hAnsi="맑은 고딕"/>
-                <w:sz w:val="19"/>
-                <w:szCs w:val="19"/>
-              </w:rPr>
-              <w:t xml:space="preserve">실습형</w:t>
-            </w:r>
-          </w:p>
-        </w:tc>
-      </w:tr>
-      <w:tr>
-        <w:trPr>
-          <w:tblHeader w:val="off"/>
-        </w:trPr>
-        <w:tc>
-          <w:tcPr>
-            <w:tcW w:type="dxa" w:w="1200"/>
-            <w:tcBorders>
-              <w:top w:val="single" w:color="BFBFBF" w:sz="4"/>
-              <w:left w:val="single" w:color="BFBFBF" w:sz="4"/>
-              <w:bottom w:val="single" w:color="BFBFBF" w:sz="4"/>
-              <w:right w:val="single" w:color="BFBFBF" w:sz="4"/>
-            </w:tcBorders>
-            <w:tcMar>
-              <w:top w:type="dxa" w:w="70"/>
-              <w:left w:type="dxa" w:w="110"/>
-              <w:bottom w:type="dxa" w:w="70"/>
-              <w:right w:type="dxa" w:w="110"/>
-            </w:tcMar>
-          </w:tcPr>
-          <w:p>
-            <w:pPr>
-              <w:spacing w:after="20" w:line="280"/>
-              <w:jc w:val="center"/>
-            </w:pPr>
-            <w:r>
-              <w:rPr>
-                <w:rFonts w:ascii="맑은 고딕" w:cs="맑은 고딕" w:eastAsia="맑은 고딕" w:hAnsi="맑은 고딕"/>
-                <w:sz w:val="19"/>
-                <w:szCs w:val="19"/>
-              </w:rPr>
-              <w:t xml:space="preserve">9월</w:t>
-            </w:r>
-          </w:p>
-        </w:tc>
-        <w:tc>
-          <w:tcPr>
-            <w:tcW w:type="dxa" w:w="3300"/>
-            <w:tcBorders>
-              <w:top w:val="single" w:color="BFBFBF" w:sz="4"/>
-              <w:left w:val="single" w:color="BFBFBF" w:sz="4"/>
-              <w:bottom w:val="single" w:color="BFBFBF" w:sz="4"/>
-              <w:right w:val="single" w:color="BFBFBF" w:sz="4"/>
-            </w:tcBorders>
-            <w:tcMar>
-              <w:top w:type="dxa" w:w="70"/>
-              <w:left w:type="dxa" w:w="110"/>
-              <w:bottom w:type="dxa" w:w="70"/>
-              <w:right w:type="dxa" w:w="110"/>
-            </w:tcMar>
-          </w:tcPr>
-          <w:p>
-            <w:pPr>
-              <w:spacing w:after="20" w:line="280"/>
-            </w:pPr>
-            <w:r>
-              <w:rPr>
-                <w:rFonts w:ascii="맑은 고딕" w:cs="맑은 고딕" w:eastAsia="맑은 고딕" w:hAnsi="맑은 고딕"/>
-                <w:sz w:val="19"/>
-                <w:szCs w:val="19"/>
-              </w:rPr>
-              <w:t xml:space="preserve">5. 산업 트렌드 세미나 ② (AI·헬스케어)</w:t>
+              <w:t xml:space="preserve">4. 산업 트렌드 세미나 ② (AI·헬스케어)</w:t>
             </w:r>
           </w:p>
         </w:tc>
@@ -4655,7 +4047,7 @@
                 <w:sz w:val="19"/>
                 <w:szCs w:val="19"/>
               </w:rPr>
-              <w:t xml:space="preserve">최신 기술 실습 세미나 ①</w:t>
+              <w:t xml:space="preserve">최신 기술 실습 세미나</w:t>
             </w:r>
           </w:p>
         </w:tc>
@@ -4685,7 +4077,7 @@
                 <w:sz w:val="19"/>
                 <w:szCs w:val="19"/>
               </w:rPr>
-              <w:t xml:space="preserve">강사료, 보조강사, 실습 환경·교재, 운영비</w:t>
+              <w:t xml:space="preserve">강사료, 보조강사, 실습 환경·교재, 운영비 (2회차)</w:t>
             </w:r>
           </w:p>
         </w:tc>
@@ -4716,7 +4108,7 @@
                 <w:sz w:val="19"/>
                 <w:szCs w:val="19"/>
               </w:rPr>
-              <w:t xml:space="preserve">350만 원</w:t>
+              <w:t xml:space="preserve">500만 원</w:t>
             </w:r>
           </w:p>
         </w:tc>
@@ -4970,7 +4362,7 @@
                 <w:sz w:val="19"/>
                 <w:szCs w:val="19"/>
               </w:rPr>
-              <w:t xml:space="preserve">250만 원</w:t>
+              <w:t xml:space="preserve">350만 원</w:t>
             </w:r>
           </w:p>
         </w:tc>
@@ -5036,7 +4428,7 @@
                 <w:sz w:val="19"/>
                 <w:szCs w:val="19"/>
               </w:rPr>
-              <w:t xml:space="preserve">최신 기술 실습 세미나 ②</w:t>
+              <w:t xml:space="preserve">산업 트렌드 세미나 ②</w:t>
             </w:r>
           </w:p>
         </w:tc>
@@ -5066,7 +4458,7 @@
                 <w:sz w:val="19"/>
                 <w:szCs w:val="19"/>
               </w:rPr>
-              <w:t xml:space="preserve">강사료, 보조강사, 실습 환경·교재, 운영비</w:t>
+              <w:t xml:space="preserve">연사료, 사회자, 네트워킹 다과, 운영비</w:t>
             </w:r>
           </w:p>
         </w:tc>
@@ -5098,133 +4490,6 @@
                 <w:szCs w:val="19"/>
               </w:rPr>
               <w:t xml:space="preserve">350만 원</w:t>
-            </w:r>
-          </w:p>
-        </w:tc>
-      </w:tr>
-      <w:tr>
-        <w:trPr>
-          <w:tblHeader w:val="off"/>
-        </w:trPr>
-        <w:tc>
-          <w:tcPr>
-            <w:tcW w:type="dxa" w:w="500"/>
-            <w:tcBorders>
-              <w:top w:val="single" w:color="BFBFBF" w:sz="4"/>
-              <w:left w:val="single" w:color="BFBFBF" w:sz="4"/>
-              <w:bottom w:val="single" w:color="BFBFBF" w:sz="4"/>
-              <w:right w:val="single" w:color="BFBFBF" w:sz="4"/>
-            </w:tcBorders>
-            <w:tcMar>
-              <w:top w:type="dxa" w:w="70"/>
-              <w:left w:type="dxa" w:w="110"/>
-              <w:bottom w:type="dxa" w:w="70"/>
-              <w:right w:type="dxa" w:w="110"/>
-            </w:tcMar>
-          </w:tcPr>
-          <w:p>
-            <w:pPr>
-              <w:spacing w:after="20" w:line="280"/>
-              <w:jc w:val="center"/>
-            </w:pPr>
-            <w:r>
-              <w:rPr>
-                <w:rFonts w:ascii="맑은 고딕" w:cs="맑은 고딕" w:eastAsia="맑은 고딕" w:hAnsi="맑은 고딕"/>
-                <w:sz w:val="19"/>
-                <w:szCs w:val="19"/>
-              </w:rPr>
-              <w:t xml:space="preserve">5</w:t>
-            </w:r>
-          </w:p>
-        </w:tc>
-        <w:tc>
-          <w:tcPr>
-            <w:tcW w:type="dxa" w:w="3300"/>
-            <w:tcBorders>
-              <w:top w:val="single" w:color="BFBFBF" w:sz="4"/>
-              <w:left w:val="single" w:color="BFBFBF" w:sz="4"/>
-              <w:bottom w:val="single" w:color="BFBFBF" w:sz="4"/>
-              <w:right w:val="single" w:color="BFBFBF" w:sz="4"/>
-            </w:tcBorders>
-            <w:tcMar>
-              <w:top w:type="dxa" w:w="70"/>
-              <w:left w:type="dxa" w:w="110"/>
-              <w:bottom w:type="dxa" w:w="70"/>
-              <w:right w:type="dxa" w:w="110"/>
-            </w:tcMar>
-          </w:tcPr>
-          <w:p>
-            <w:pPr>
-              <w:spacing w:after="20" w:line="280"/>
-            </w:pPr>
-            <w:r>
-              <w:rPr>
-                <w:rFonts w:ascii="맑은 고딕" w:cs="맑은 고딕" w:eastAsia="맑은 고딕" w:hAnsi="맑은 고딕"/>
-                <w:sz w:val="19"/>
-                <w:szCs w:val="19"/>
-              </w:rPr>
-              <w:t xml:space="preserve">산업 트렌드 세미나 ②</w:t>
-            </w:r>
-          </w:p>
-        </w:tc>
-        <w:tc>
-          <w:tcPr>
-            <w:tcW w:type="dxa" w:w="3838"/>
-            <w:tcBorders>
-              <w:top w:val="single" w:color="BFBFBF" w:sz="4"/>
-              <w:left w:val="single" w:color="BFBFBF" w:sz="4"/>
-              <w:bottom w:val="single" w:color="BFBFBF" w:sz="4"/>
-              <w:right w:val="single" w:color="BFBFBF" w:sz="4"/>
-            </w:tcBorders>
-            <w:tcMar>
-              <w:top w:type="dxa" w:w="70"/>
-              <w:left w:type="dxa" w:w="110"/>
-              <w:bottom w:type="dxa" w:w="70"/>
-              <w:right w:type="dxa" w:w="110"/>
-            </w:tcMar>
-          </w:tcPr>
-          <w:p>
-            <w:pPr>
-              <w:spacing w:after="20" w:line="280"/>
-            </w:pPr>
-            <w:r>
-              <w:rPr>
-                <w:rFonts w:ascii="맑은 고딕" w:cs="맑은 고딕" w:eastAsia="맑은 고딕" w:hAnsi="맑은 고딕"/>
-                <w:sz w:val="19"/>
-                <w:szCs w:val="19"/>
-              </w:rPr>
-              <w:t xml:space="preserve">연사료, 사회자, 네트워킹 다과, 운영비</w:t>
-            </w:r>
-          </w:p>
-        </w:tc>
-        <w:tc>
-          <w:tcPr>
-            <w:tcW w:type="dxa" w:w="2000"/>
-            <w:tcBorders>
-              <w:top w:val="single" w:color="BFBFBF" w:sz="4"/>
-              <w:left w:val="single" w:color="BFBFBF" w:sz="4"/>
-              <w:bottom w:val="single" w:color="BFBFBF" w:sz="4"/>
-              <w:right w:val="single" w:color="BFBFBF" w:sz="4"/>
-            </w:tcBorders>
-            <w:tcMar>
-              <w:top w:type="dxa" w:w="70"/>
-              <w:left w:type="dxa" w:w="110"/>
-              <w:bottom w:type="dxa" w:w="70"/>
-              <w:right w:type="dxa" w:w="110"/>
-            </w:tcMar>
-          </w:tcPr>
-          <w:p>
-            <w:pPr>
-              <w:spacing w:after="20" w:line="280"/>
-              <w:jc w:val="right"/>
-            </w:pPr>
-            <w:r>
-              <w:rPr>
-                <w:rFonts w:ascii="맑은 고딕" w:cs="맑은 고딕" w:eastAsia="맑은 고딕" w:hAnsi="맑은 고딕"/>
-                <w:sz w:val="19"/>
-                <w:szCs w:val="19"/>
-              </w:rPr>
-              <w:t xml:space="preserve">250만 원</w:t>
             </w:r>
           </w:p>
         </w:tc>
@@ -5406,7 +4671,7 @@
           <w:sz w:val="21"/>
           <w:szCs w:val="21"/>
         </w:rPr>
-        <w:t xml:space="preserve">지역 기업 실무자 및 경영진의 AI 활용 역량 강화 (연 200명 이상 참여)</w:t>
+        <w:t xml:space="preserve">지역 기업 실무자 및 경영진의 AI 활용 역량 강화 (연 220명 참여)</w:t>
       </w:r>
     </w:p>
     <w:p>
@@ -5474,7 +4739,7 @@
           <w:sz w:val="21"/>
           <w:szCs w:val="21"/>
         </w:rPr>
-        <w:t xml:space="preserve">※ 참여 인원: 실습 세미나 160명 + AI 업무자동화 40명 + 트렌드 세미나 100명 = 총 300명 (중복 참가 제외 전)</w:t>
+        <w:t xml:space="preserve">※ 참여 인원: 실습 세미나 80명 + AI 업무자동화 40명 + 트렌드 세미나 100명 = 총 220명 (중복 참가 제외 전)</w:t>
       </w:r>
     </w:p>
     <w:p>

</xml_diff>

<commit_message>
Move practice seminar to August and reorder programs chronologically
Co-Authored-By: Claude Sonnet 5.5 <noreply@anthropic.com>
Claude-Session: https://claude.ai/code/session_017gbqRLzmn2gitw8QdSmDmj
</commit_message>
<xml_diff>
--- a/2027_DIP_교육프로그램_제안서_초안.docx
+++ b/2027_DIP_교육프로그램_제안서_초안.docx
@@ -625,7 +625,7 @@
                 <w:sz w:val="19"/>
                 <w:szCs w:val="19"/>
               </w:rPr>
-              <w:t xml:space="preserve">최신 기술 실습 세미나</w:t>
+              <w:t xml:space="preserve">중소기업·스타트업 인재 운영·관리 AI 업무자동화 실습</w:t>
             </w:r>
           </w:p>
         </w:tc>
@@ -656,7 +656,7 @@
                 <w:sz w:val="19"/>
                 <w:szCs w:val="19"/>
               </w:rPr>
-              <w:t xml:space="preserve">6월 초</w:t>
+              <w:t xml:space="preserve">6월 말</w:t>
             </w:r>
           </w:p>
         </w:tc>
@@ -686,7 +686,8 @@
                 <w:sz w:val="19"/>
                 <w:szCs w:val="19"/>
               </w:rPr>
-              <w:t xml:space="preserve">40명 × 2회차(총 80명)</w:t>
+              <w:t xml:space="preserve">법인 임원·인사 담당자
+20명 × 2회차(총 40명)</w:t>
             </w:r>
           </w:p>
         </w:tc>
@@ -716,7 +717,7 @@
                 <w:sz w:val="19"/>
                 <w:szCs w:val="19"/>
               </w:rPr>
-              <w:t xml:space="preserve">실습 중심 세미나</w:t>
+              <w:t xml:space="preserve">1박 2일, 회차당 8시간 실습</w:t>
             </w:r>
           </w:p>
         </w:tc>
@@ -747,7 +748,7 @@
                 <w:sz w:val="19"/>
                 <w:szCs w:val="19"/>
               </w:rPr>
-              <w:t xml:space="preserve">500만 원</w:t>
+              <w:t xml:space="preserve">800만 원</w:t>
             </w:r>
           </w:p>
         </w:tc>
@@ -813,7 +814,8 @@
                 <w:sz w:val="19"/>
                 <w:szCs w:val="19"/>
               </w:rPr>
-              <w:t xml:space="preserve">중소기업·스타트업 인재 운영·관리 AI 업무자동화 실습</w:t>
+              <w:t xml:space="preserve">산업 트렌드 세미나 ①
+(반도체·로봇·미래모빌리티)</w:t>
             </w:r>
           </w:p>
         </w:tc>
@@ -844,7 +846,7 @@
                 <w:sz w:val="19"/>
                 <w:szCs w:val="19"/>
               </w:rPr>
-              <w:t xml:space="preserve">6월 말</w:t>
+              <w:t xml:space="preserve">7월</w:t>
             </w:r>
           </w:p>
         </w:tc>
@@ -874,8 +876,7 @@
                 <w:sz w:val="19"/>
                 <w:szCs w:val="19"/>
               </w:rPr>
-              <w:t xml:space="preserve">법인 임원·인사 담당자
-20명 × 2회차(총 40명)</w:t>
+              <w:t xml:space="preserve">50명</w:t>
             </w:r>
           </w:p>
         </w:tc>
@@ -905,7 +906,8 @@
                 <w:sz w:val="19"/>
                 <w:szCs w:val="19"/>
               </w:rPr>
-              <w:t xml:space="preserve">1박 2일, 회차당 8시간 실습</w:t>
+              <w:t xml:space="preserve">평일 15~18시
+세미나 + 네트워킹</w:t>
             </w:r>
           </w:p>
         </w:tc>
@@ -936,7 +938,7 @@
                 <w:sz w:val="19"/>
                 <w:szCs w:val="19"/>
               </w:rPr>
-              <w:t xml:space="preserve">800만 원</w:t>
+              <w:t xml:space="preserve">350만 원</w:t>
             </w:r>
           </w:p>
         </w:tc>
@@ -1002,8 +1004,7 @@
                 <w:sz w:val="19"/>
                 <w:szCs w:val="19"/>
               </w:rPr>
-              <w:t xml:space="preserve">산업 트렌드 세미나 ①
-(반도체·로봇·미래모빌리티)</w:t>
+              <w:t xml:space="preserve">최신 기술 실습 세미나</w:t>
             </w:r>
           </w:p>
         </w:tc>
@@ -1034,7 +1035,7 @@
                 <w:sz w:val="19"/>
                 <w:szCs w:val="19"/>
               </w:rPr>
-              <w:t xml:space="preserve">7월</w:t>
+              <w:t xml:space="preserve">8월</w:t>
             </w:r>
           </w:p>
         </w:tc>
@@ -1064,7 +1065,7 @@
                 <w:sz w:val="19"/>
                 <w:szCs w:val="19"/>
               </w:rPr>
-              <w:t xml:space="preserve">50명</w:t>
+              <w:t xml:space="preserve">40명 × 2회차(총 80명)</w:t>
             </w:r>
           </w:p>
         </w:tc>
@@ -1094,8 +1095,7 @@
                 <w:sz w:val="19"/>
                 <w:szCs w:val="19"/>
               </w:rPr>
-              <w:t xml:space="preserve">평일 15~18시
-세미나 + 네트워킹</w:t>
+              <w:t xml:space="preserve">실습 중심 세미나</w:t>
             </w:r>
           </w:p>
         </w:tc>
@@ -1126,7 +1126,7 @@
                 <w:sz w:val="19"/>
                 <w:szCs w:val="19"/>
               </w:rPr>
-              <w:t xml:space="preserve">350만 원</w:t>
+              <w:t xml:space="preserve">500만 원</w:t>
             </w:r>
           </w:p>
         </w:tc>
@@ -1521,7 +1521,7 @@
           <w:sz w:val="21"/>
           <w:szCs w:val="21"/>
         </w:rPr>
-        <w:t xml:space="preserve">※ 2번은 회차당 20명 규모로 2회 운영하며, 프로그램별 세부 예산은 협의를 통해 조정할 수 있습니다.</w:t>
+        <w:t xml:space="preserve">※ 1번은 회차당 20명 규모로 2회 운영하며, 프로그램별 세부 예산은 협의를 통해 조정할 수 있습니다.</w:t>
       </w:r>
     </w:p>
     <w:p>
@@ -1558,7 +1558,7 @@
           <w:sz w:val="24"/>
           <w:szCs w:val="24"/>
         </w:rPr>
-        <w:t xml:space="preserve">프로그램 1. 최신 기술 실습 세미나 (6월 초)</w:t>
+        <w:t xml:space="preserve">프로그램 1. 인재 운영·관리 AI 업무자동화 실습 (6월 말, 1박 2일)</w:t>
       </w:r>
     </w:p>
     <w:tbl>
@@ -1637,7 +1637,7 @@
                 <w:sz w:val="19"/>
                 <w:szCs w:val="19"/>
               </w:rPr>
-              <w:t xml:space="preserve">지역 기업 실무자가 최신 기술을 직접 다뤄보며 현업 적용 방법을 익힘</w:t>
+              <w:t xml:space="preserve">채용·평가·교육·근태 등 인재 운영·관리 업무를 AI로 자동화하는 방법을 실습으로 체득</w:t>
             </w:r>
           </w:p>
         </w:tc>
@@ -1672,7 +1672,7 @@
                 <w:sz w:val="19"/>
                 <w:szCs w:val="19"/>
               </w:rPr>
-              <w:t xml:space="preserve">대상 / 규모</w:t>
+              <w:t xml:space="preserve">참가 자격</w:t>
             </w:r>
           </w:p>
         </w:tc>
@@ -1702,7 +1702,7 @@
                 <w:sz w:val="19"/>
                 <w:szCs w:val="19"/>
               </w:rPr>
-              <w:t xml:space="preserve">지역 기업·스타트업 실무자, 40명 × 2회차</w:t>
+              <w:t xml:space="preserve">중소기업·스타트업 법인 임원, 인사 담당자</w:t>
             </w:r>
           </w:p>
         </w:tc>
@@ -1737,7 +1737,7 @@
                 <w:sz w:val="19"/>
                 <w:szCs w:val="19"/>
               </w:rPr>
-              <w:t xml:space="preserve">운영 방식</w:t>
+              <w:t xml:space="preserve">대상 / 규모</w:t>
             </w:r>
           </w:p>
         </w:tc>
@@ -1767,7 +1767,7 @@
                 <w:sz w:val="19"/>
                 <w:szCs w:val="19"/>
               </w:rPr>
-              <w:t xml:space="preserve">1회 완결형 실습 세미나 (개념 소개 → 시연 → 개인 실습 → 적용 아이디어 공유)</w:t>
+              <w:t xml:space="preserve">회차당 20명 × 2회차, 총 40명 (회차당 1박 2일, 실습 8시간)</w:t>
             </w:r>
           </w:p>
         </w:tc>
@@ -1802,7 +1802,7 @@
                 <w:sz w:val="19"/>
                 <w:szCs w:val="19"/>
               </w:rPr>
-              <w:t xml:space="preserve">주제 후보</w:t>
+              <w:t xml:space="preserve">운영 방식</w:t>
             </w:r>
           </w:p>
         </w:tc>
@@ -1832,7 +1832,7 @@
                 <w:sz w:val="19"/>
                 <w:szCs w:val="19"/>
               </w:rPr>
-              <w:t xml:space="preserve">DIP가 희망하는 기술 분야 반영 (예: 생성형 AI 활용, AI 에이전트, 노코드·바이브코딩 등) – 협의 후 확정</w:t>
+              <w:t xml:space="preserve">소수 정예 밀착형 실습: 강사 1명 + 보조강사 2명 상시 배치</w:t>
             </w:r>
           </w:p>
         </w:tc>
@@ -1867,6 +1867,74 @@
                 <w:sz w:val="19"/>
                 <w:szCs w:val="19"/>
               </w:rPr>
+              <w:t xml:space="preserve">커리큘럼(안)</w:t>
+            </w:r>
+          </w:p>
+        </w:tc>
+        <w:tc>
+          <w:tcPr>
+            <w:tcW w:type="dxa" w:w="7738"/>
+            <w:tcBorders>
+              <w:top w:val="single" w:color="BFBFBF" w:sz="4"/>
+              <w:left w:val="single" w:color="BFBFBF" w:sz="4"/>
+              <w:bottom w:val="single" w:color="BFBFBF" w:sz="4"/>
+              <w:right w:val="single" w:color="BFBFBF" w:sz="4"/>
+            </w:tcBorders>
+            <w:tcMar>
+              <w:top w:type="dxa" w:w="70"/>
+              <w:left w:type="dxa" w:w="110"/>
+              <w:bottom w:type="dxa" w:w="70"/>
+              <w:right w:type="dxa" w:w="110"/>
+            </w:tcMar>
+          </w:tcPr>
+          <w:p>
+            <w:pPr>
+              <w:spacing w:after="20" w:line="280"/>
+            </w:pPr>
+            <w:r>
+              <w:rPr>
+                <w:rFonts w:ascii="맑은 고딕" w:cs="맑은 고딕" w:eastAsia="맑은 고딕" w:hAnsi="맑은 고딕"/>
+                <w:sz w:val="19"/>
+                <w:szCs w:val="19"/>
+              </w:rPr>
+              <w:t xml:space="preserve">① 인사·조직 업무 진단 및 자동화 대상 발굴
+② 생성형 AI 기반 문서·공고·평가 자료 자동 작성
+③ 반복 업무 자동화 워크플로 구성 실습
+④ 우리 회사 적용 계획 수립 및 발표</w:t>
+            </w:r>
+          </w:p>
+        </w:tc>
+      </w:tr>
+      <w:tr>
+        <w:tc>
+          <w:tcPr>
+            <w:tcW w:type="dxa" w:w="1900"/>
+            <w:tcBorders>
+              <w:top w:val="single" w:color="BFBFBF" w:sz="4"/>
+              <w:left w:val="single" w:color="BFBFBF" w:sz="4"/>
+              <w:bottom w:val="single" w:color="BFBFBF" w:sz="4"/>
+              <w:right w:val="single" w:color="BFBFBF" w:sz="4"/>
+            </w:tcBorders>
+            <w:shd w:fill="D9E2F3" w:color="auto" w:val="clear"/>
+            <w:tcMar>
+              <w:top w:type="dxa" w:w="70"/>
+              <w:left w:type="dxa" w:w="110"/>
+              <w:bottom w:type="dxa" w:w="70"/>
+              <w:right w:type="dxa" w:w="110"/>
+            </w:tcMar>
+          </w:tcPr>
+          <w:p>
+            <w:pPr>
+              <w:spacing w:after="20" w:line="280"/>
+            </w:pPr>
+            <w:r>
+              <w:rPr>
+                <w:rFonts w:ascii="맑은 고딕" w:cs="맑은 고딕" w:eastAsia="맑은 고딕" w:hAnsi="맑은 고딕"/>
+                <w:b/>
+                <w:bCs/>
+                <w:sz w:val="19"/>
+                <w:szCs w:val="19"/>
+              </w:rPr>
               <w:t xml:space="preserve">기대 결과</w:t>
             </w:r>
           </w:p>
@@ -1897,7 +1965,72 @@
                 <w:sz w:val="19"/>
                 <w:szCs w:val="19"/>
               </w:rPr>
-              <w:t xml:space="preserve">참가자별 실습 결과물 확보, 교육 후 업무 적용 사례 수집</w:t>
+              <w:t xml:space="preserve">참가자 소속 기업별 「AI 업무자동화 적용 계획서」 작성, 교육 후 현업 즉시 적용</w:t>
+            </w:r>
+          </w:p>
+        </w:tc>
+      </w:tr>
+      <w:tr>
+        <w:tc>
+          <w:tcPr>
+            <w:tcW w:type="dxa" w:w="1900"/>
+            <w:tcBorders>
+              <w:top w:val="single" w:color="BFBFBF" w:sz="4"/>
+              <w:left w:val="single" w:color="BFBFBF" w:sz="4"/>
+              <w:bottom w:val="single" w:color="BFBFBF" w:sz="4"/>
+              <w:right w:val="single" w:color="BFBFBF" w:sz="4"/>
+            </w:tcBorders>
+            <w:shd w:fill="D9E2F3" w:color="auto" w:val="clear"/>
+            <w:tcMar>
+              <w:top w:type="dxa" w:w="70"/>
+              <w:left w:type="dxa" w:w="110"/>
+              <w:bottom w:type="dxa" w:w="70"/>
+              <w:right w:type="dxa" w:w="110"/>
+            </w:tcMar>
+          </w:tcPr>
+          <w:p>
+            <w:pPr>
+              <w:spacing w:after="20" w:line="280"/>
+            </w:pPr>
+            <w:r>
+              <w:rPr>
+                <w:rFonts w:ascii="맑은 고딕" w:cs="맑은 고딕" w:eastAsia="맑은 고딕" w:hAnsi="맑은 고딕"/>
+                <w:b/>
+                <w:bCs/>
+                <w:sz w:val="19"/>
+                <w:szCs w:val="19"/>
+              </w:rPr>
+              <w:t xml:space="preserve">소요 비용</w:t>
+            </w:r>
+          </w:p>
+        </w:tc>
+        <w:tc>
+          <w:tcPr>
+            <w:tcW w:type="dxa" w:w="7738"/>
+            <w:tcBorders>
+              <w:top w:val="single" w:color="BFBFBF" w:sz="4"/>
+              <w:left w:val="single" w:color="BFBFBF" w:sz="4"/>
+              <w:bottom w:val="single" w:color="BFBFBF" w:sz="4"/>
+              <w:right w:val="single" w:color="BFBFBF" w:sz="4"/>
+            </w:tcBorders>
+            <w:tcMar>
+              <w:top w:type="dxa" w:w="70"/>
+              <w:left w:type="dxa" w:w="110"/>
+              <w:bottom w:type="dxa" w:w="70"/>
+              <w:right w:type="dxa" w:w="110"/>
+            </w:tcMar>
+          </w:tcPr>
+          <w:p>
+            <w:pPr>
+              <w:spacing w:after="20" w:line="280"/>
+            </w:pPr>
+            <w:r>
+              <w:rPr>
+                <w:rFonts w:ascii="맑은 고딕" w:cs="맑은 고딕" w:eastAsia="맑은 고딕" w:hAnsi="맑은 고딕"/>
+                <w:sz w:val="19"/>
+                <w:szCs w:val="19"/>
+              </w:rPr>
+              <w:t xml:space="preserve">강사·보조강사 인건비 일 400만 원 × 2일 = 800만 원</w:t>
             </w:r>
           </w:p>
         </w:tc>
@@ -1917,7 +2050,7 @@
           <w:sz w:val="24"/>
           <w:szCs w:val="24"/>
         </w:rPr>
-        <w:t xml:space="preserve">프로그램 2. 인재 운영·관리 AI 업무자동화 실습 (6월 말, 1박 2일)</w:t>
+        <w:t xml:space="preserve">프로그램 2. 산업 트렌드 세미나 ① – 반도체 · 로봇 · 미래모빌리티 (7월)</w:t>
       </w:r>
     </w:p>
     <w:tbl>
@@ -1966,7 +2099,7 @@
                 <w:sz w:val="19"/>
                 <w:szCs w:val="19"/>
               </w:rPr>
-              <w:t xml:space="preserve">목적</w:t>
+              <w:t xml:space="preserve">일정 / 규모</w:t>
             </w:r>
           </w:p>
         </w:tc>
@@ -1996,7 +2129,7 @@
                 <w:sz w:val="19"/>
                 <w:szCs w:val="19"/>
               </w:rPr>
-              <w:t xml:space="preserve">채용·평가·교육·근태 등 인재 운영·관리 업무를 AI로 자동화하는 방법을 실습으로 체득</w:t>
+              <w:t xml:space="preserve">7월 중 평일 오후 3시~6시, 50명</w:t>
             </w:r>
           </w:p>
         </w:tc>
@@ -2031,7 +2164,7 @@
                 <w:sz w:val="19"/>
                 <w:szCs w:val="19"/>
               </w:rPr>
-              <w:t xml:space="preserve">참가 자격</w:t>
+              <w:t xml:space="preserve">연사(안)</w:t>
             </w:r>
           </w:p>
         </w:tc>
@@ -2061,7 +2194,7 @@
                 <w:sz w:val="19"/>
                 <w:szCs w:val="19"/>
               </w:rPr>
-              <w:t xml:space="preserve">중소기업·스타트업 법인 임원, 인사 담당자</w:t>
+              <w:t xml:space="preserve">마음AI 팀장, AI 반도체 분야 전문가 (섭외 협의 중)</w:t>
             </w:r>
           </w:p>
         </w:tc>
@@ -2096,7 +2229,7 @@
                 <w:sz w:val="19"/>
                 <w:szCs w:val="19"/>
               </w:rPr>
-              <w:t xml:space="preserve">대상 / 규모</w:t>
+              <w:t xml:space="preserve">진행</w:t>
             </w:r>
           </w:p>
         </w:tc>
@@ -2126,7 +2259,8 @@
                 <w:sz w:val="19"/>
                 <w:szCs w:val="19"/>
               </w:rPr>
-              <w:t xml:space="preserve">회차당 20명 × 2회차, 총 40명 (회차당 1박 2일, 실습 8시간)</w:t>
+              <w:t xml:space="preserve">15:00~16:30 세미나 (주제 발표 + 질의응답)
+16:30~18:00 네트워킹 (스탠딩 형태)</w:t>
             </w:r>
           </w:p>
         </w:tc>
@@ -2161,7 +2295,7 @@
                 <w:sz w:val="19"/>
                 <w:szCs w:val="19"/>
               </w:rPr>
-              <w:t xml:space="preserve">운영 방식</w:t>
+              <w:t xml:space="preserve">장소</w:t>
             </w:r>
           </w:p>
         </w:tc>
@@ -2191,7 +2325,7 @@
                 <w:sz w:val="19"/>
                 <w:szCs w:val="19"/>
               </w:rPr>
-              <w:t xml:space="preserve">소수 정예 밀착형 실습: 강사 1명 + 보조강사 2명 상시 배치</w:t>
+              <w:t xml:space="preserve">DIP 2~3층 대형 공간 (센터장 언급 공간 활용, 스탠딩 운영 가능)</w:t>
             </w:r>
           </w:p>
         </w:tc>
@@ -2226,7 +2360,7 @@
                 <w:sz w:val="19"/>
                 <w:szCs w:val="19"/>
               </w:rPr>
-              <w:t xml:space="preserve">커리큘럼(안)</w:t>
+              <w:t xml:space="preserve">기대 결과</w:t>
             </w:r>
           </w:p>
         </w:tc>
@@ -2256,140 +2390,7 @@
                 <w:sz w:val="19"/>
                 <w:szCs w:val="19"/>
               </w:rPr>
-              <w:t xml:space="preserve">① 인사·조직 업무 진단 및 자동화 대상 발굴
-② 생성형 AI 기반 문서·공고·평가 자료 자동 작성
-③ 반복 업무 자동화 워크플로 구성 실습
-④ 우리 회사 적용 계획 수립 및 발표</w:t>
-            </w:r>
-          </w:p>
-        </w:tc>
-      </w:tr>
-      <w:tr>
-        <w:tc>
-          <w:tcPr>
-            <w:tcW w:type="dxa" w:w="1900"/>
-            <w:tcBorders>
-              <w:top w:val="single" w:color="BFBFBF" w:sz="4"/>
-              <w:left w:val="single" w:color="BFBFBF" w:sz="4"/>
-              <w:bottom w:val="single" w:color="BFBFBF" w:sz="4"/>
-              <w:right w:val="single" w:color="BFBFBF" w:sz="4"/>
-            </w:tcBorders>
-            <w:shd w:fill="D9E2F3" w:color="auto" w:val="clear"/>
-            <w:tcMar>
-              <w:top w:type="dxa" w:w="70"/>
-              <w:left w:type="dxa" w:w="110"/>
-              <w:bottom w:type="dxa" w:w="70"/>
-              <w:right w:type="dxa" w:w="110"/>
-            </w:tcMar>
-          </w:tcPr>
-          <w:p>
-            <w:pPr>
-              <w:spacing w:after="20" w:line="280"/>
-            </w:pPr>
-            <w:r>
-              <w:rPr>
-                <w:rFonts w:ascii="맑은 고딕" w:cs="맑은 고딕" w:eastAsia="맑은 고딕" w:hAnsi="맑은 고딕"/>
-                <w:b/>
-                <w:bCs/>
-                <w:sz w:val="19"/>
-                <w:szCs w:val="19"/>
-              </w:rPr>
-              <w:t xml:space="preserve">기대 결과</w:t>
-            </w:r>
-          </w:p>
-        </w:tc>
-        <w:tc>
-          <w:tcPr>
-            <w:tcW w:type="dxa" w:w="7738"/>
-            <w:tcBorders>
-              <w:top w:val="single" w:color="BFBFBF" w:sz="4"/>
-              <w:left w:val="single" w:color="BFBFBF" w:sz="4"/>
-              <w:bottom w:val="single" w:color="BFBFBF" w:sz="4"/>
-              <w:right w:val="single" w:color="BFBFBF" w:sz="4"/>
-            </w:tcBorders>
-            <w:tcMar>
-              <w:top w:type="dxa" w:w="70"/>
-              <w:left w:type="dxa" w:w="110"/>
-              <w:bottom w:type="dxa" w:w="70"/>
-              <w:right w:type="dxa" w:w="110"/>
-            </w:tcMar>
-          </w:tcPr>
-          <w:p>
-            <w:pPr>
-              <w:spacing w:after="20" w:line="280"/>
-            </w:pPr>
-            <w:r>
-              <w:rPr>
-                <w:rFonts w:ascii="맑은 고딕" w:cs="맑은 고딕" w:eastAsia="맑은 고딕" w:hAnsi="맑은 고딕"/>
-                <w:sz w:val="19"/>
-                <w:szCs w:val="19"/>
-              </w:rPr>
-              <w:t xml:space="preserve">참가자 소속 기업별 「AI 업무자동화 적용 계획서」 작성, 교육 후 현업 즉시 적용</w:t>
-            </w:r>
-          </w:p>
-        </w:tc>
-      </w:tr>
-      <w:tr>
-        <w:tc>
-          <w:tcPr>
-            <w:tcW w:type="dxa" w:w="1900"/>
-            <w:tcBorders>
-              <w:top w:val="single" w:color="BFBFBF" w:sz="4"/>
-              <w:left w:val="single" w:color="BFBFBF" w:sz="4"/>
-              <w:bottom w:val="single" w:color="BFBFBF" w:sz="4"/>
-              <w:right w:val="single" w:color="BFBFBF" w:sz="4"/>
-            </w:tcBorders>
-            <w:shd w:fill="D9E2F3" w:color="auto" w:val="clear"/>
-            <w:tcMar>
-              <w:top w:type="dxa" w:w="70"/>
-              <w:left w:type="dxa" w:w="110"/>
-              <w:bottom w:type="dxa" w:w="70"/>
-              <w:right w:type="dxa" w:w="110"/>
-            </w:tcMar>
-          </w:tcPr>
-          <w:p>
-            <w:pPr>
-              <w:spacing w:after="20" w:line="280"/>
-            </w:pPr>
-            <w:r>
-              <w:rPr>
-                <w:rFonts w:ascii="맑은 고딕" w:cs="맑은 고딕" w:eastAsia="맑은 고딕" w:hAnsi="맑은 고딕"/>
-                <w:b/>
-                <w:bCs/>
-                <w:sz w:val="19"/>
-                <w:szCs w:val="19"/>
-              </w:rPr>
-              <w:t xml:space="preserve">소요 비용</w:t>
-            </w:r>
-          </w:p>
-        </w:tc>
-        <w:tc>
-          <w:tcPr>
-            <w:tcW w:type="dxa" w:w="7738"/>
-            <w:tcBorders>
-              <w:top w:val="single" w:color="BFBFBF" w:sz="4"/>
-              <w:left w:val="single" w:color="BFBFBF" w:sz="4"/>
-              <w:bottom w:val="single" w:color="BFBFBF" w:sz="4"/>
-              <w:right w:val="single" w:color="BFBFBF" w:sz="4"/>
-            </w:tcBorders>
-            <w:tcMar>
-              <w:top w:type="dxa" w:w="70"/>
-              <w:left w:type="dxa" w:w="110"/>
-              <w:bottom w:type="dxa" w:w="70"/>
-              <w:right w:type="dxa" w:w="110"/>
-            </w:tcMar>
-          </w:tcPr>
-          <w:p>
-            <w:pPr>
-              <w:spacing w:after="20" w:line="280"/>
-            </w:pPr>
-            <w:r>
-              <w:rPr>
-                <w:rFonts w:ascii="맑은 고딕" w:cs="맑은 고딕" w:eastAsia="맑은 고딕" w:hAnsi="맑은 고딕"/>
-                <w:sz w:val="19"/>
-                <w:szCs w:val="19"/>
-              </w:rPr>
-              <w:t xml:space="preserve">강사·보조강사 인건비 일 400만 원 × 2일 = 800만 원</w:t>
+              <w:t xml:space="preserve">첨단 산업 트렌드 공유, 지역 기업 간·기업–전문가 간 협업 접점 마련</w:t>
             </w:r>
           </w:p>
         </w:tc>
@@ -2409,7 +2410,7 @@
           <w:sz w:val="24"/>
           <w:szCs w:val="24"/>
         </w:rPr>
-        <w:t xml:space="preserve">프로그램 3. 산업 트렌드 세미나 ① – 반도체 · 로봇 · 미래모빌리티 (7월)</w:t>
+        <w:t xml:space="preserve">프로그램 3. 최신 기술 실습 세미나 (8월)</w:t>
       </w:r>
     </w:p>
     <w:tbl>
@@ -2458,7 +2459,7 @@
                 <w:sz w:val="19"/>
                 <w:szCs w:val="19"/>
               </w:rPr>
-              <w:t xml:space="preserve">일정 / 규모</w:t>
+              <w:t xml:space="preserve">목적</w:t>
             </w:r>
           </w:p>
         </w:tc>
@@ -2488,7 +2489,7 @@
                 <w:sz w:val="19"/>
                 <w:szCs w:val="19"/>
               </w:rPr>
-              <w:t xml:space="preserve">7월 중 평일 오후 3시~6시, 50명</w:t>
+              <w:t xml:space="preserve">지역 기업 실무자가 최신 기술을 직접 다뤄보며 현업 적용 방법을 익힘</w:t>
             </w:r>
           </w:p>
         </w:tc>
@@ -2523,7 +2524,7 @@
                 <w:sz w:val="19"/>
                 <w:szCs w:val="19"/>
               </w:rPr>
-              <w:t xml:space="preserve">연사(안)</w:t>
+              <w:t xml:space="preserve">대상 / 규모</w:t>
             </w:r>
           </w:p>
         </w:tc>
@@ -2553,7 +2554,7 @@
                 <w:sz w:val="19"/>
                 <w:szCs w:val="19"/>
               </w:rPr>
-              <w:t xml:space="preserve">마음AI 팀장, AI 반도체 분야 전문가 (섭외 협의 중)</w:t>
+              <w:t xml:space="preserve">지역 기업·스타트업 실무자, 40명 × 2회차</w:t>
             </w:r>
           </w:p>
         </w:tc>
@@ -2588,7 +2589,7 @@
                 <w:sz w:val="19"/>
                 <w:szCs w:val="19"/>
               </w:rPr>
-              <w:t xml:space="preserve">진행</w:t>
+              <w:t xml:space="preserve">운영 방식</w:t>
             </w:r>
           </w:p>
         </w:tc>
@@ -2618,8 +2619,7 @@
                 <w:sz w:val="19"/>
                 <w:szCs w:val="19"/>
               </w:rPr>
-              <w:t xml:space="preserve">15:00~16:30 세미나 (주제 발표 + 질의응답)
-16:30~18:00 네트워킹 (스탠딩 형태)</w:t>
+              <w:t xml:space="preserve">1회 완결형 실습 세미나 (개념 소개 → 시연 → 개인 실습 → 적용 아이디어 공유)</w:t>
             </w:r>
           </w:p>
         </w:tc>
@@ -2654,7 +2654,7 @@
                 <w:sz w:val="19"/>
                 <w:szCs w:val="19"/>
               </w:rPr>
-              <w:t xml:space="preserve">장소</w:t>
+              <w:t xml:space="preserve">주제 후보</w:t>
             </w:r>
           </w:p>
         </w:tc>
@@ -2684,7 +2684,7 @@
                 <w:sz w:val="19"/>
                 <w:szCs w:val="19"/>
               </w:rPr>
-              <w:t xml:space="preserve">DIP 2~3층 대형 공간 (센터장 언급 공간 활용, 스탠딩 운영 가능)</w:t>
+              <w:t xml:space="preserve">DIP가 희망하는 기술 분야 반영 (예: 생성형 AI 활용, AI 에이전트, 노코드·바이브코딩 등) – 협의 후 확정</w:t>
             </w:r>
           </w:p>
         </w:tc>
@@ -2749,7 +2749,7 @@
                 <w:sz w:val="19"/>
                 <w:szCs w:val="19"/>
               </w:rPr>
-              <w:t xml:space="preserve">첨단 산업 트렌드 공유, 지역 기업 간·기업–전문가 간 협업 접점 마련</w:t>
+              <w:t xml:space="preserve">참가자별 실습 결과물 확보, 교육 후 업무 적용 사례 수집</w:t>
             </w:r>
           </w:p>
         </w:tc>
@@ -3329,7 +3329,7 @@
                 <w:sz w:val="19"/>
                 <w:szCs w:val="19"/>
               </w:rPr>
-              <w:t xml:space="preserve">6월 초</w:t>
+              <w:t xml:space="preserve">6월 말</w:t>
             </w:r>
           </w:p>
         </w:tc>
@@ -3359,7 +3359,7 @@
                 <w:sz w:val="19"/>
                 <w:szCs w:val="19"/>
               </w:rPr>
-              <w:t xml:space="preserve">1. 최신 기술 실습 세미나</w:t>
+              <w:t xml:space="preserve">1. 인재 운영·관리 AI 업무자동화 (1박 2일)</w:t>
             </w:r>
           </w:p>
         </w:tc>
@@ -3389,7 +3389,7 @@
                 <w:sz w:val="19"/>
                 <w:szCs w:val="19"/>
               </w:rPr>
-              <w:t xml:space="preserve">40명 × 2회</w:t>
+              <w:t xml:space="preserve">20명 × 2회</w:t>
             </w:r>
           </w:p>
         </w:tc>
@@ -3419,7 +3419,7 @@
                 <w:sz w:val="19"/>
                 <w:szCs w:val="19"/>
               </w:rPr>
-              <w:t xml:space="preserve">실습형</w:t>
+              <w:t xml:space="preserve">임원·인사 담당자</w:t>
             </w:r>
           </w:p>
         </w:tc>
@@ -3455,7 +3455,7 @@
                 <w:sz w:val="19"/>
                 <w:szCs w:val="19"/>
               </w:rPr>
-              <w:t xml:space="preserve">6월 말</w:t>
+              <w:t xml:space="preserve">7월</w:t>
             </w:r>
           </w:p>
         </w:tc>
@@ -3485,7 +3485,7 @@
                 <w:sz w:val="19"/>
                 <w:szCs w:val="19"/>
               </w:rPr>
-              <w:t xml:space="preserve">2. 인재 운영·관리 AI 업무자동화 (1박 2일)</w:t>
+              <w:t xml:space="preserve">2. 산업 트렌드 세미나 ① (반도체·로봇·모빌리티)</w:t>
             </w:r>
           </w:p>
         </w:tc>
@@ -3515,7 +3515,7 @@
                 <w:sz w:val="19"/>
                 <w:szCs w:val="19"/>
               </w:rPr>
-              <w:t xml:space="preserve">20명 × 2회</w:t>
+              <w:t xml:space="preserve">50명</w:t>
             </w:r>
           </w:p>
         </w:tc>
@@ -3545,7 +3545,7 @@
                 <w:sz w:val="19"/>
                 <w:szCs w:val="19"/>
               </w:rPr>
-              <w:t xml:space="preserve">임원·인사 담당자</w:t>
+              <w:t xml:space="preserve">세미나 + 네트워킹</w:t>
             </w:r>
           </w:p>
         </w:tc>
@@ -3581,7 +3581,7 @@
                 <w:sz w:val="19"/>
                 <w:szCs w:val="19"/>
               </w:rPr>
-              <w:t xml:space="preserve">7월</w:t>
+              <w:t xml:space="preserve">8월</w:t>
             </w:r>
           </w:p>
         </w:tc>
@@ -3611,7 +3611,7 @@
                 <w:sz w:val="19"/>
                 <w:szCs w:val="19"/>
               </w:rPr>
-              <w:t xml:space="preserve">3. 산업 트렌드 세미나 ① (반도체·로봇·모빌리티)</w:t>
+              <w:t xml:space="preserve">3. 최신 기술 실습 세미나</w:t>
             </w:r>
           </w:p>
         </w:tc>
@@ -3641,7 +3641,7 @@
                 <w:sz w:val="19"/>
                 <w:szCs w:val="19"/>
               </w:rPr>
-              <w:t xml:space="preserve">50명</w:t>
+              <w:t xml:space="preserve">40명 × 2회</w:t>
             </w:r>
           </w:p>
         </w:tc>
@@ -3671,7 +3671,7 @@
                 <w:sz w:val="19"/>
                 <w:szCs w:val="19"/>
               </w:rPr>
-              <w:t xml:space="preserve">세미나 + 네트워킹</w:t>
+              <w:t xml:space="preserve">실습형</w:t>
             </w:r>
           </w:p>
         </w:tc>
@@ -4047,7 +4047,7 @@
                 <w:sz w:val="19"/>
                 <w:szCs w:val="19"/>
               </w:rPr>
-              <w:t xml:space="preserve">최신 기술 실습 세미나</w:t>
+              <w:t xml:space="preserve">AI 업무자동화 실습 (1박 2일)</w:t>
             </w:r>
           </w:p>
         </w:tc>
@@ -4077,7 +4077,7 @@
                 <w:sz w:val="19"/>
                 <w:szCs w:val="19"/>
               </w:rPr>
-              <w:t xml:space="preserve">강사료, 보조강사, 실습 환경·교재, 운영비 (2회차)</w:t>
+              <w:t xml:space="preserve">강사·보조강사(2명) 인건비 일 400만 원 × 2일</w:t>
             </w:r>
           </w:p>
         </w:tc>
@@ -4108,7 +4108,7 @@
                 <w:sz w:val="19"/>
                 <w:szCs w:val="19"/>
               </w:rPr>
-              <w:t xml:space="preserve">500만 원</w:t>
+              <w:t xml:space="preserve">800만 원</w:t>
             </w:r>
           </w:p>
         </w:tc>
@@ -4174,7 +4174,7 @@
                 <w:sz w:val="19"/>
                 <w:szCs w:val="19"/>
               </w:rPr>
-              <w:t xml:space="preserve">AI 업무자동화 실습 (1박 2일)</w:t>
+              <w:t xml:space="preserve">산업 트렌드 세미나 ①</w:t>
             </w:r>
           </w:p>
         </w:tc>
@@ -4204,7 +4204,7 @@
                 <w:sz w:val="19"/>
                 <w:szCs w:val="19"/>
               </w:rPr>
-              <w:t xml:space="preserve">강사·보조강사(2명) 인건비 일 400만 원 × 2일</w:t>
+              <w:t xml:space="preserve">연사료, 사회자, 네트워킹 다과, 운영비</w:t>
             </w:r>
           </w:p>
         </w:tc>
@@ -4235,7 +4235,7 @@
                 <w:sz w:val="19"/>
                 <w:szCs w:val="19"/>
               </w:rPr>
-              <w:t xml:space="preserve">800만 원</w:t>
+              <w:t xml:space="preserve">350만 원</w:t>
             </w:r>
           </w:p>
         </w:tc>
@@ -4301,7 +4301,7 @@
                 <w:sz w:val="19"/>
                 <w:szCs w:val="19"/>
               </w:rPr>
-              <w:t xml:space="preserve">산업 트렌드 세미나 ①</w:t>
+              <w:t xml:space="preserve">최신 기술 실습 세미나</w:t>
             </w:r>
           </w:p>
         </w:tc>
@@ -4331,7 +4331,7 @@
                 <w:sz w:val="19"/>
                 <w:szCs w:val="19"/>
               </w:rPr>
-              <w:t xml:space="preserve">연사료, 사회자, 네트워킹 다과, 운영비</w:t>
+              <w:t xml:space="preserve">강사료, 보조강사, 실습 환경·교재, 운영비 (2회차)</w:t>
             </w:r>
           </w:p>
         </w:tc>
@@ -4362,7 +4362,7 @@
                 <w:sz w:val="19"/>
                 <w:szCs w:val="19"/>
               </w:rPr>
-              <w:t xml:space="preserve">350만 원</w:t>
+              <w:t xml:space="preserve">500만 원</w:t>
             </w:r>
           </w:p>
         </w:tc>

</xml_diff>

<commit_message>
Rebalance budget with common overhead line
Co-Authored-By: Claude Sonnet 5.5 <noreply@anthropic.com>
Claude-Session: https://claude.ai/code/session_017gbqRLzmn2gitw8QdSmDmj
</commit_message>
<xml_diff>
--- a/2027_DIP_교육프로그램_제안서_초안.docx
+++ b/2027_DIP_교육프로그램_제안서_초안.docx
@@ -326,7 +326,7 @@
           <w:sz w:val="21"/>
           <w:szCs w:val="21"/>
         </w:rPr>
-        <w:t xml:space="preserve">연간 총 4개 프로그램(총 6회차 운영), 총 사업비 2,000만 원 규모로 구성하였습니다.</w:t>
+        <w:t xml:space="preserve">연간 총 4개 프로그램(총 6회차 운영)과 공통 부대비용을 포함해 총 사업비 2,000만 원 규모로 구성하였습니다.</w:t>
       </w:r>
     </w:p>
     <w:tbl>
@@ -3911,7 +3911,7 @@
                 <w:sz w:val="19"/>
                 <w:szCs w:val="19"/>
               </w:rPr>
-              <w:t xml:space="preserve">프로그램</w:t>
+              <w:t xml:space="preserve">구분</w:t>
             </w:r>
           </w:p>
         </w:tc>

</xml_diff>